<commit_message>
Switch to Option 1: ExpenseTracker core functionality (Python and C++)
Records with date, amount, category and description; listing oldest first;
category filtering through an index; totals by category and overall. Both
implementations report $511.94 across nine records.

Python stores dicts in a dict keyed by id with a defaultdict category index and
parses dates with datetime. C++ declares a struct, stores records in a
std::vector and indexes them with std::unordered_map, using reserve and
std::move and containing no new or delete.
</commit_message>
<xml_diff>
--- a/report/D2_Saturday_Core_Functionality.docx
+++ b/report/D2_Saturday_Core_Functionality.docx
@@ -13,7 +13,7 @@
         <w:rPr>
           <w:b/>
         </w:rPr>
-        <w:t>ConcurrentChat: Core Functionality Implementation</w:t>
+        <w:t>ExpenseTracker: Core Functionality Implementation</w:t>
       </w:r>
     </w:p>
     <w:p/>
@@ -22,7 +22,7 @@
         <w:jc w:val="center"/>
       </w:pPr>
       <w:r>
-        <w:t>Group Project Deliverable 2 (Saturday) - Option 2: Simple Chat Application</w:t>
+        <w:t>Group Project Deliverable 2 (Saturday) - Option 1: Expense Tracker Application</w:t>
       </w:r>
     </w:p>
     <w:p>
@@ -30,7 +30,7 @@
         <w:jc w:val="center"/>
       </w:pPr>
       <w:r>
-        <w:t>Languages: Rust and Go</w:t>
+        <w:t>Languages: Python and C++</w:t>
       </w:r>
     </w:p>
     <w:p>
@@ -96,7 +96,7 @@
           <w:b/>
         </w:rPr>
         <w:lastRenderedPageBreak/>
-        <w:t>ConcurrentChat: Core Functionality Implementation</w:t>
+        <w:t>ExpenseTracker: Core Functionality Implementation</w:t>
       </w:r>
     </w:p>
     <w:p>
@@ -115,7 +115,7 @@
         <w:ind w:firstLine="720"/>
       </w:pPr>
       <w:r>
-        <w:t>The core of ConcurrentChat is implemented and operational in both languages. Three simulated users run concurrently, each posting a join event, three messages and a leave event to a hub that owns the message history. Both implementations record the same fifteen messages and shut down cleanly. Filtering, keyword search, direct messages, the interactive prompt and the throughput benchmark are scheduled for Sunday and are not part of this deliverable.</w:t>
+        <w:t>The core of ExpenseTracker is implemented and operational in both languages. Each stores a seeded set of nine expenses with a date, an amount, a category and a description, lists them oldest first, filters them by category through an index, and reports totals by category and overall. Both report the same figures. Date-range filtering, keyword search, percentage shares, deletion, the interactive prompt, the benchmark and the automated tests are scheduled for Sunday.</w:t>
       </w:r>
     </w:p>
     <w:p>
@@ -147,8 +147,8 @@
         <w:tblLook w:val="04A0" w:firstRow="1" w:lastRow="0" w:firstColumn="1" w:lastColumn="0" w:noHBand="0" w:noVBand="1"/>
       </w:tblPr>
       <w:tblGrid>
-        <w:gridCol w:w="6336"/>
-        <w:gridCol w:w="2736"/>
+        <w:gridCol w:w="6480"/>
+        <w:gridCol w:w="2592"/>
       </w:tblGrid>
       <w:tr>
         <w:trPr>
@@ -157,7 +157,7 @@
         </w:trPr>
         <w:tc>
           <w:tcPr>
-            <w:tcW w:w="6336" w:type="dxa"/>
+            <w:tcW w:w="6480" w:type="dxa"/>
             <w:tcBorders>
               <w:top w:val="single" w:sz="8" w:space="0" w:color="000000"/>
               <w:bottom w:val="single" w:sz="8" w:space="0" w:color="000000"/>
@@ -177,7 +177,7 @@
         </w:tc>
         <w:tc>
           <w:tcPr>
-            <w:tcW w:w="2736" w:type="dxa"/>
+            <w:tcW w:w="2592" w:type="dxa"/>
             <w:tcBorders>
               <w:top w:val="single" w:sz="8" w:space="0" w:color="000000"/>
               <w:bottom w:val="single" w:sz="8" w:space="0" w:color="000000"/>
@@ -202,7 +202,7 @@
         </w:trPr>
         <w:tc>
           <w:tcPr>
-            <w:tcW w:w="6336" w:type="dxa"/>
+            <w:tcW w:w="6480" w:type="dxa"/>
           </w:tcPr>
           <w:p>
             <w:pPr>
@@ -212,13 +212,13 @@
               <w:rPr>
                 <w:sz w:val="20"/>
               </w:rPr>
-              <w:t>Simulate multiple users sending messages concurrently</w:t>
+              <w:t>Store expenses with date, amount, category and description</w:t>
             </w:r>
           </w:p>
         </w:tc>
         <w:tc>
           <w:tcPr>
-            <w:tcW w:w="2736" w:type="dxa"/>
+            <w:tcW w:w="2592" w:type="dxa"/>
           </w:tcPr>
           <w:p>
             <w:pPr>
@@ -239,7 +239,7 @@
         </w:trPr>
         <w:tc>
           <w:tcPr>
-            <w:tcW w:w="6336" w:type="dxa"/>
+            <w:tcW w:w="6480" w:type="dxa"/>
           </w:tcPr>
           <w:p>
             <w:pPr>
@@ -249,13 +249,13 @@
               <w:rPr>
                 <w:sz w:val="20"/>
               </w:rPr>
-              <w:t>Store message history with timestamp and user ID</w:t>
+              <w:t>List every expense, oldest first</w:t>
             </w:r>
           </w:p>
         </w:tc>
         <w:tc>
           <w:tcPr>
-            <w:tcW w:w="2736" w:type="dxa"/>
+            <w:tcW w:w="2592" w:type="dxa"/>
           </w:tcPr>
           <w:p>
             <w:pPr>
@@ -276,7 +276,7 @@
         </w:trPr>
         <w:tc>
           <w:tcPr>
-            <w:tcW w:w="6336" w:type="dxa"/>
+            <w:tcW w:w="6480" w:type="dxa"/>
           </w:tcPr>
           <w:p>
             <w:pPr>
@@ -286,13 +286,13 @@
               <w:rPr>
                 <w:sz w:val="20"/>
               </w:rPr>
-              <w:t>Hub solely owns history, so no lock is required</w:t>
+              <w:t>Filter by category using an index rather than a scan</w:t>
             </w:r>
           </w:p>
         </w:tc>
         <w:tc>
           <w:tcPr>
-            <w:tcW w:w="2736" w:type="dxa"/>
+            <w:tcW w:w="2592" w:type="dxa"/>
           </w:tcPr>
           <w:p>
             <w:pPr>
@@ -313,7 +313,7 @@
         </w:trPr>
         <w:tc>
           <w:tcPr>
-            <w:tcW w:w="6336" w:type="dxa"/>
+            <w:tcW w:w="6480" w:type="dxa"/>
           </w:tcPr>
           <w:p>
             <w:pPr>
@@ -323,13 +323,13 @@
               <w:rPr>
                 <w:sz w:val="20"/>
               </w:rPr>
-              <w:t>Clean shutdown reporting the recorded count</w:t>
+              <w:t>Totals by category and overall</w:t>
             </w:r>
           </w:p>
         </w:tc>
         <w:tc>
           <w:tcPr>
-            <w:tcW w:w="2736" w:type="dxa"/>
+            <w:tcW w:w="2592" w:type="dxa"/>
           </w:tcPr>
           <w:p>
             <w:pPr>
@@ -350,7 +350,7 @@
         </w:trPr>
         <w:tc>
           <w:tcPr>
-            <w:tcW w:w="6336" w:type="dxa"/>
+            <w:tcW w:w="6480" w:type="dxa"/>
           </w:tcPr>
           <w:p>
             <w:pPr>
@@ -360,13 +360,13 @@
               <w:rPr>
                 <w:sz w:val="20"/>
               </w:rPr>
-              <w:t>Filtering and search by user or keyword</w:t>
+              <w:t>Date-range filter and keyword search</w:t>
             </w:r>
           </w:p>
         </w:tc>
         <w:tc>
           <w:tcPr>
-            <w:tcW w:w="2736" w:type="dxa"/>
+            <w:tcW w:w="2592" w:type="dxa"/>
           </w:tcPr>
           <w:p>
             <w:pPr>
@@ -387,7 +387,7 @@
         </w:trPr>
         <w:tc>
           <w:tcPr>
-            <w:tcW w:w="6336" w:type="dxa"/>
+            <w:tcW w:w="6480" w:type="dxa"/>
           </w:tcPr>
           <w:p>
             <w:pPr>
@@ -397,13 +397,13 @@
               <w:rPr>
                 <w:sz w:val="20"/>
               </w:rPr>
-              <w:t>Direct messages, statistics, interactive prompt, benchmark</w:t>
+              <w:t>Percentage shares, delete, interactive prompt, benchmark</w:t>
             </w:r>
           </w:p>
         </w:tc>
         <w:tc>
           <w:tcPr>
-            <w:tcW w:w="2736" w:type="dxa"/>
+            <w:tcW w:w="2592" w:type="dxa"/>
           </w:tcPr>
           <w:p>
             <w:pPr>
@@ -424,7 +424,7 @@
         </w:trPr>
         <w:tc>
           <w:tcPr>
-            <w:tcW w:w="6336" w:type="dxa"/>
+            <w:tcW w:w="6480" w:type="dxa"/>
             <w:tcBorders>
               <w:bottom w:val="single" w:sz="8" w:space="0" w:color="000000"/>
             </w:tcBorders>
@@ -443,7 +443,7 @@
         </w:tc>
         <w:tc>
           <w:tcPr>
-            <w:tcW w:w="2736" w:type="dxa"/>
+            <w:tcW w:w="2592" w:type="dxa"/>
             <w:tcBorders>
               <w:bottom w:val="single" w:sz="8" w:space="0" w:color="000000"/>
             </w:tcBorders>
@@ -483,7 +483,10 @@
         <w:ind w:firstLine="720"/>
       </w:pPr>
       <w:r>
-        <w:t>Both programs follow the architecture agreed on Friday: user workers hold only a sending handle, and the history lives inside a single hub worker. Rust spawns one Tokio task per user and sends commands over an mpsc channel, with replies returning on a oneshot channel so that exactly one response is expressible in the type. Go spawns one goroutine per user and uses a select loop in the hub over its channels, with a sync.WaitGroup governing lifecycle.</w:t>
+        <w:t>Both programs follow the two-layer design agreed on Friday: a store owns the records and answers queries, and a driver prints the results. The difference is visible in the first ten lines of each file. Python holds each expense as a dictionary inside a dictionary keyed by id, with a defaultdict mapping each category to a list of ids. C++ declares a struct whose fields are fixed at compile time, stores the records in a std::vector and indexes them with a std::unordered_map. Both indexes are hash tables, so t</w:t>
+      </w:r>
+      <w:r>
+        <w:t>he two programs do the same algorithmic work.</w:t>
       </w:r>
     </w:p>
     <w:p>
@@ -491,11 +494,11 @@
         <w:ind w:firstLine="720"/>
       </w:pPr>
       <w:r>
-        <w:t xml:space="preserve">The first substantive difference appeared immediately, in how the five message kinds are modelled. Rust expresses them as a data-carrying enum in which each variant holds exactly the fields it needs, and the compiler checks that every match covers every variant. Go has no such construct, so a message is one struct with a Kind tag plus the union of the fields any kind might </w:t>
+        <w:t xml:space="preserve">The second difference is in how a value enters the system. The Python store converts the amount with float(), which accepts an int, a float or the string "34.25" without complaint, and the </w:t>
       </w:r>
       <w:r>
         <w:lastRenderedPageBreak/>
-        <w:t>need. The Body field therefore exists on join and leave events, where it is meaningless, and a switch on Kind that misses a case compiles without complaint. Both programs include a fallthrough branch in their rendering function, but only the Go one can actually be reached.</w:t>
+        <w:t>demo ends by adding exactly such a string to show that it works. The C++ signature declares the parameter as a double, so the equivalent call is rejected by the compiler and never reaches a test. Dates show the same split: Python parses with datetime.strptime from the standard library, while the C++ version has a hand-written parse_date because C++20 supplies a calendar type but not a parser in this toolchain.</w:t>
       </w:r>
     </w:p>
     <w:p>
@@ -514,7 +517,7 @@
         <w:ind w:firstLine="720"/>
       </w:pPr>
       <w:r>
-        <w:t>Both implementations were built and run in WSL2 Ubuntu 24.04 using rustc and cargo 1.95.0 and Go 1.27.1, so that a single machine underlies every result. Each run records fifteen messages: three users times one join, three text messages and one leave. The ordering of the interleaved messages differs between runs and between the two languages, which is the concurrency being visible rather than a defect; the counts do not vary.</w:t>
+        <w:t>Both implementations were built and run in WSL2 Ubuntu 24.04 using Python 3.12.3 and g++ 13.3.0, so a single machine underlies every result. The C++ build is clean under -Wall -Wextra. Each program reports nine records totalling $511.94, and $546.19 after the tenth expense is added, with identical per-category totals.</w:t>
       </w:r>
     </w:p>
     <w:p>
@@ -536,7 +539,7 @@
         <w:rPr>
           <w:i/>
         </w:rPr>
-        <w:t>Rust Core Implementation Running</w:t>
+        <w:t>Python Core Implementation Running</w:t>
       </w:r>
     </w:p>
     <w:p>
@@ -549,7 +552,7 @@
           <w:noProof/>
         </w:rPr>
         <w:drawing>
-          <wp:inline distT="0" distB="0" distL="0" distR="0" wp14:anchorId="435CEEFA" wp14:editId="5F48B533">
+          <wp:inline distT="0" distB="0" distL="0" distR="0" wp14:anchorId="2DF366A8" wp14:editId="6DB608F4">
             <wp:extent cx="5760720" cy="3160508"/>
             <wp:effectExtent l="0" t="0" r="0" b="0"/>
             <wp:docPr id="1" name="Picture 1"/>
@@ -560,7 +563,7 @@
               <a:graphicData uri="http://schemas.openxmlformats.org/drawingml/2006/picture">
                 <pic:pic xmlns:pic="http://schemas.openxmlformats.org/drawingml/2006/picture">
                   <pic:nvPicPr>
-                    <pic:cNvPr id="0" name="02_rust_core_demo.png"/>
+                    <pic:cNvPr id="0" name="01_python_core.png"/>
                     <pic:cNvPicPr/>
                   </pic:nvPicPr>
                   <pic:blipFill>
@@ -600,7 +603,7 @@
         <w:rPr>
           <w:sz w:val="20"/>
         </w:rPr>
-        <w:t>Fifteen messages recorded. Message identifiers are assigned by the hub in arrival order, so the interleaving of alice, bob and carol reflects the scheduler rather than the script.</w:t>
+        <w:t>The final line adds an amount supplied as the string "34.25", which Python accepts silently. The equivalent call does not compile in C++.</w:t>
       </w:r>
     </w:p>
     <w:p>
@@ -623,7 +626,7 @@
         <w:rPr>
           <w:i/>
         </w:rPr>
-        <w:t>Go Core Implementation Running</w:t>
+        <w:t>C++ Core Implementation Running</w:t>
       </w:r>
     </w:p>
     <w:p>
@@ -636,7 +639,7 @@
           <w:noProof/>
         </w:rPr>
         <w:drawing>
-          <wp:inline distT="0" distB="0" distL="0" distR="0" wp14:anchorId="035C5134" wp14:editId="07A3EC0B">
+          <wp:inline distT="0" distB="0" distL="0" distR="0" wp14:anchorId="7B82753E" wp14:editId="56D8CE6C">
             <wp:extent cx="5760720" cy="3160508"/>
             <wp:effectExtent l="0" t="0" r="0" b="0"/>
             <wp:docPr id="2" name="Picture 2"/>
@@ -647,7 +650,7 @@
               <a:graphicData uri="http://schemas.openxmlformats.org/drawingml/2006/picture">
                 <pic:pic xmlns:pic="http://schemas.openxmlformats.org/drawingml/2006/picture">
                   <pic:nvPicPr>
-                    <pic:cNvPr id="0" name="01_go_core_demo.png"/>
+                    <pic:cNvPr id="0" name="02_cpp_core.png"/>
                     <pic:cNvPicPr/>
                   </pic:nvPicPr>
                   <pic:blipFill>
@@ -687,7 +690,7 @@
         <w:rPr>
           <w:sz w:val="20"/>
         </w:rPr>
-        <w:t>The same fifteen messages, with a different interleaving produced by the Go scheduler.</w:t>
+        <w:t>The same nine records and the same totals, produced from a std::vector of structs indexed by a std::unordered_map.</w:t>
       </w:r>
     </w:p>
     <w:p>
@@ -706,7 +709,7 @@
         <w:ind w:firstLine="720"/>
       </w:pPr>
       <w:r>
-        <w:t>Both files are organised the same way, with the domain model first, then the hub, then the driver, and each language-specific decision is commented where it occurs rather than only in this report. Testing at this stage was manual: repeated runs confirming that the recorded count is always fifteen, that every user contributes a join and a leave, and that both programs terminate without hanging. Automated unit tests, go vet and the Go race detector are part of Sunday’s deliverable.</w:t>
+        <w:t>Both files are organised the same way, with the record type first, then the store, then the driver, and each language-specific decision is commented where it occurs rather than only in this report. Testing at this stage was manual: confirming that the listing is ordered oldest first, that the category filter returns the three grocery records, and that the per-category totals sum to the overall total in both programs. Automated tests and a sanitizer run are part of Sunday’s deliverable.</w:t>
       </w:r>
     </w:p>
     <w:p>
@@ -725,11 +728,11 @@
         <w:ind w:firstLine="720"/>
       </w:pPr>
       <w:r>
-        <w:t xml:space="preserve">Two problems surfaced during the day. First, an early Go draft gave the hub a separate channel for each command type. Because select chooses at random among ready cases, a query could be served before queued posts had been appended. The risk had been anticipated on Friday, and the fix is scheduled for Day 3: route every command through one ordered channel, </w:t>
+        <w:t xml:space="preserve">Two problems surfaced during the day. First, the C++ store indexes records by their position in the vector, and pushing a record while holding a reference to the vector’s contents is unsafe once the vector reallocates. We reserved capacity up front and took the category string </w:t>
       </w:r>
       <w:r>
         <w:lastRenderedPageBreak/>
-        <w:t>which is what the Rust design does implicitly by carrying a single command enum on one channel. Second, both implementations initially produced all of one user’s messages before any of another’s, because each worker ran to completion before yielding. Inserting an explicit yield between sends restored the interleaving that makes the concurrency observable.</w:t>
+        <w:t>before the move, which resolved it; the deeper consequence for deletion is deferred to Day 3. Second, category matching initially differed between the two programs because Python lower-cased the category on entry and C++ did not, so a search for "Groceries" returned three records in one program and none in the other. Both now normalise the category when the record is created.</w:t>
       </w:r>
     </w:p>
     <w:p>
@@ -776,16 +779,16 @@
         <w:ind w:left="720" w:hanging="720"/>
       </w:pPr>
       <w:r>
-        <w:t xml:space="preserve">Donovan, A. A. A., &amp; Kernighan, B. W. (2015). </w:t>
+        <w:t xml:space="preserve">Python Software Foundation. (2026). </w:t>
       </w:r>
       <w:r>
         <w:rPr>
           <w:i/>
         </w:rPr>
-        <w:t>The Go programming language</w:t>
+        <w:t>The Python language reference</w:t>
       </w:r>
       <w:r>
-        <w:t>. Addison-Wesley.</w:t>
+        <w:t xml:space="preserve"> (Version 3.14). Retrieved October 3, 2026, from https://docs.python.org/3/reference/</w:t>
       </w:r>
     </w:p>
     <w:p>
@@ -793,16 +796,16 @@
         <w:ind w:left="720" w:hanging="720"/>
       </w:pPr>
       <w:r>
-        <w:t xml:space="preserve">Klabnik, S., &amp; Nichols, C. (2023). </w:t>
+        <w:t xml:space="preserve">Stroustrup, B. (2013). </w:t>
       </w:r>
       <w:r>
         <w:rPr>
           <w:i/>
         </w:rPr>
-        <w:t>The Rust programming language</w:t>
+        <w:t>The C++ programming language</w:t>
       </w:r>
       <w:r>
-        <w:t xml:space="preserve"> (2nd ed.). No Starch Press.</w:t>
+        <w:t xml:space="preserve"> (4th ed.). Addison-Wesley.</w:t>
       </w:r>
     </w:p>
     <w:sectPr>
@@ -1069,31 +1072,31 @@
       </w:rPr>
     </w:lvl>
   </w:abstractNum>
-  <w:num w:numId="1" w16cid:durableId="571813741">
+  <w:num w:numId="1" w16cid:durableId="1868904031">
     <w:abstractNumId w:val="8"/>
   </w:num>
-  <w:num w:numId="2" w16cid:durableId="1345590336">
+  <w:num w:numId="2" w16cid:durableId="1646274314">
     <w:abstractNumId w:val="6"/>
   </w:num>
-  <w:num w:numId="3" w16cid:durableId="155658357">
+  <w:num w:numId="3" w16cid:durableId="398290361">
     <w:abstractNumId w:val="5"/>
   </w:num>
-  <w:num w:numId="4" w16cid:durableId="1579172110">
+  <w:num w:numId="4" w16cid:durableId="96945305">
     <w:abstractNumId w:val="4"/>
   </w:num>
-  <w:num w:numId="5" w16cid:durableId="1742633653">
+  <w:num w:numId="5" w16cid:durableId="1722166260">
     <w:abstractNumId w:val="7"/>
   </w:num>
-  <w:num w:numId="6" w16cid:durableId="429357449">
+  <w:num w:numId="6" w16cid:durableId="1907910419">
     <w:abstractNumId w:val="3"/>
   </w:num>
-  <w:num w:numId="7" w16cid:durableId="1760441496">
+  <w:num w:numId="7" w16cid:durableId="1510943096">
     <w:abstractNumId w:val="2"/>
   </w:num>
-  <w:num w:numId="8" w16cid:durableId="1762604932">
+  <w:num w:numId="8" w16cid:durableId="1593123503">
     <w:abstractNumId w:val="1"/>
   </w:num>
-  <w:num w:numId="9" w16cid:durableId="1352340960">
+  <w:num w:numId="9" w16cid:durableId="753629510">
     <w:abstractNumId w:val="0"/>
   </w:num>
 </w:numbering>

</xml_diff>